<commit_message>
Bake app.freightwire.com domain into proposal-API spec (PDF, Word, md)
</commit_message>
<xml_diff>
--- a/claude/deliverables/Freightwire-Proposal-API-Spec.docx
+++ b/claude/deliverables/Freightwire-Proposal-API-Spec.docx
@@ -47,12 +47,12 @@
           <w:rFonts w:ascii="Consolas" w:hAnsi="Consolas"/>
           <w:sz w:val="18"/>
         </w:rPr>
-        <w:t xml:space="preserve">POST https://&lt;FREIGHTWIRE-DOMAIN&gt;/api/v1/admin/customers</w:t>
-      </w:r>
-    </w:p>
-    <w:p>
-      <w:r>
-        <w:t xml:space="preserve">(A live domain and a separate test domain to build against first will be provided.)</w:t>
+        <w:t xml:space="preserve">POST https://app.freightwire.com/api/v1/admin/customers</w:t>
+      </w:r>
+    </w:p>
+    <w:p>
+      <w:r>
+        <w:t xml:space="preserve">(A separate test URL to build against first will be provided, so nothing real is touched while you develop.)</w:t>
       </w:r>
     </w:p>
     <w:p>
@@ -960,7 +960,7 @@
           <w:rFonts w:ascii="Consolas" w:hAnsi="Consolas"/>
           <w:sz w:val="18"/>
         </w:rPr>
-        <w:t xml:space="preserve">curl -X POST https://&lt;FREIGHTWIRE-DOMAIN&gt;/api/v1/admin/customers \</w:t>
+        <w:t xml:space="preserve">curl -X POST https://app.freightwire.com/api/v1/admin/customers \</w:t>
       </w:r>
       <w:r>
         <w:br/>

</xml_diff>